<commit_message>
changes to the docs
</commit_message>
<xml_diff>
--- a/public/collabria-cms-guide.docx
+++ b/public/collabria-cms-guide.docx
@@ -1,6 +1,6 @@
 
 <file path=word/document.xml><?xml version="1.0" encoding="utf-8"?>
-<w:document xmlns:wpc="http://schemas.microsoft.com/office/word/2010/wordprocessingCanvas" xmlns:cx="http://schemas.microsoft.com/office/drawing/2014/chartex" xmlns:cx1="http://schemas.microsoft.com/office/drawing/2015/9/8/chartex" xmlns:cx2="http://schemas.microsoft.com/office/drawing/2015/10/21/chartex" xmlns:cx3="http://schemas.microsoft.com/office/drawing/2016/5/9/chartex" xmlns:cx4="http://schemas.microsoft.com/office/drawing/2016/5/10/chartex" xmlns:cx5="http://schemas.microsoft.com/office/drawing/2016/5/11/chartex" xmlns:cx6="http://schemas.microsoft.com/office/drawing/2016/5/12/chartex" xmlns:cx7="http://schemas.microsoft.com/office/drawing/2016/5/13/chartex" xmlns:cx8="http://schemas.microsoft.com/office/drawing/2016/5/14/chartex" xmlns:mc="http://schemas.openxmlformats.org/markup-compatibility/2006" xmlns:aink="http://schemas.microsoft.com/office/drawing/2016/ink" xmlns:am3d="http://schemas.microsoft.com/office/drawing/2017/model3d" xmlns:o="urn:schemas-microsoft-com:office:office" xmlns:oel="http://schemas.microsoft.com/office/2019/extlst" xmlns:r="http://schemas.openxmlformats.org/officeDocument/2006/relationships" xmlns:m="http://schemas.openxmlformats.org/officeDocument/2006/math" xmlns:v="urn:schemas-microsoft-com:vml" xmlns:wp14="http://schemas.microsoft.com/office/word/2010/wordprocessingDrawing" xmlns:wp="http://schemas.openxmlformats.org/drawingml/2006/wordprocessingDrawing" xmlns:w10="urn:schemas-microsoft-com:office:word" xmlns:w="http://schemas.openxmlformats.org/wordprocessingml/2006/main" xmlns:w14="http://schemas.microsoft.com/office/word/2010/wordml" xmlns:w15="http://schemas.microsoft.com/office/word/2012/wordml" xmlns:w16cex="http://schemas.microsoft.com/office/word/2018/wordml/cex" xmlns:w16cid="http://schemas.microsoft.com/office/word/2016/wordml/cid" xmlns:w16="http://schemas.microsoft.com/office/word/2018/wordml" xmlns:w16du="http://schemas.microsoft.com/office/word/2023/wordml/word16du" xmlns:w16sdtdh="http://schemas.microsoft.com/office/word/2020/wordml/sdtdatahash" xmlns:w16sdtfl="http://schemas.microsoft.com/office/word/2024/wordml/sdtformatlock" xmlns:w16se="http://schemas.microsoft.com/office/word/2015/wordml/symex" xmlns:wpg="http://schemas.microsoft.com/office/word/2010/wordprocessingGroup" xmlns:wpi="http://schemas.microsoft.com/office/word/2010/wordprocessingInk" xmlns:wne="http://schemas.microsoft.com/office/word/2006/wordml" xmlns:wps="http://schemas.microsoft.com/office/word/2010/wordprocessingShape" mc:Ignorable="w14 w15 w16se w16cid w16 w16cex w16sdtdh w16sdtfl w16du wp14">
+<w:document xmlns:wpc="http://schemas.microsoft.com/office/word/2010/wordprocessingCanvas" xmlns:cx="http://schemas.microsoft.com/office/drawing/2014/chartex" xmlns:cx1="http://schemas.microsoft.com/office/drawing/2015/9/8/chartex" xmlns:cx2="http://schemas.microsoft.com/office/drawing/2015/10/21/chartex" xmlns:cx3="http://schemas.microsoft.com/office/drawing/2016/5/9/chartex" xmlns:cx4="http://schemas.microsoft.com/office/drawing/2016/5/10/chartex" xmlns:cx5="http://schemas.microsoft.com/office/drawing/2016/5/11/chartex" xmlns:cx6="http://schemas.microsoft.com/office/drawing/2016/5/12/chartex" xmlns:cx7="http://schemas.microsoft.com/office/drawing/2016/5/13/chartex" xmlns:cx8="http://schemas.microsoft.com/office/drawing/2016/5/14/chartex" xmlns:mc="http://schemas.openxmlformats.org/markup-compatibility/2006" xmlns:m="http://schemas.openxmlformats.org/officeDocument/2006/math" xmlns:aink="http://schemas.microsoft.com/office/drawing/2016/ink" xmlns:am3d="http://schemas.microsoft.com/office/drawing/2017/model3d" xmlns:oel="http://schemas.microsoft.com/office/2019/extlst" xmlns:r="http://schemas.openxmlformats.org/officeDocument/2006/relationships" xmlns:wp14="http://schemas.microsoft.com/office/word/2010/wordprocessingDrawing" xmlns:wp="http://schemas.openxmlformats.org/drawingml/2006/wordprocessingDrawing" xmlns:wpg="http://schemas.microsoft.com/office/word/2010/wordprocessingGroup" xmlns:wpi="http://schemas.microsoft.com/office/word/2010/wordprocessingInk" xmlns:wps="http://schemas.microsoft.com/office/word/2010/wordprocessingShape" xmlns:o="urn:schemas-microsoft-com:office:office" xmlns:v="urn:schemas-microsoft-com:vml" xmlns:w10="urn:schemas-microsoft-com:office:word" xmlns:w="http://schemas.openxmlformats.org/wordprocessingml/2006/main" xmlns:w14="http://schemas.microsoft.com/office/word/2010/wordml" xmlns:w15="http://schemas.microsoft.com/office/word/2012/wordml" xmlns:w16cex="http://schemas.microsoft.com/office/word/2018/wordml/cex" xmlns:w16cid="http://schemas.microsoft.com/office/word/2016/wordml/cid" xmlns:w16="http://schemas.microsoft.com/office/word/2018/wordml" xmlns:w16sdtdh="http://schemas.microsoft.com/office/word/2020/wordml/sdtdatahash" xmlns:w16sdtfl="http://schemas.microsoft.com/office/word/2024/wordml/sdtformatlock" xmlns:w16se="http://schemas.microsoft.com/office/word/2015/wordml/symex" xmlns:w16du="http://schemas.microsoft.com/office/word/2023/wordml/word16du" xmlns:wne="http://schemas.microsoft.com/office/word/2006/wordml" mc:Ignorable="w14 w15 w16se w16cid w16 w16cex w16sdtdh w16sdtfl w16du wp14">
   <w:body>
     <w:p>
       <w:pPr>
@@ -69,7 +69,25 @@
           <w:sz w:val="20"/>
           <w:szCs w:val="20"/>
         </w:rPr>
-        <w:t>collabria-astro.vercel.app/admin</w:t>
+        <w:t>collabria</w:t>
+      </w:r>
+      <w:r>
+        <w:rPr>
+          <w:rFonts w:ascii="Arial" w:eastAsia="Arial" w:hAnsi="Arial" w:cs="Arial"/>
+          <w:color w:val="C9AA88"/>
+          <w:sz w:val="20"/>
+          <w:szCs w:val="20"/>
+        </w:rPr>
+        <w:t>inc.com</w:t>
+      </w:r>
+      <w:r>
+        <w:rPr>
+          <w:rFonts w:ascii="Arial" w:eastAsia="Arial" w:hAnsi="Arial" w:cs="Arial"/>
+          <w:color w:val="C9AA88"/>
+          <w:sz w:val="20"/>
+          <w:szCs w:val="20"/>
+        </w:rPr>
+        <w:t>/admin</w:t>
       </w:r>
     </w:p>
     <w:p>
@@ -143,7 +161,25 @@
           <w:sz w:val="20"/>
           <w:szCs w:val="20"/>
         </w:rPr>
-        <w:t>https://collabria-astro.vercel.app/admin</w:t>
+        <w:t>https://collabria</w:t>
+      </w:r>
+      <w:r>
+        <w:rPr>
+          <w:rFonts w:ascii="Courier New" w:eastAsia="Courier New" w:hAnsi="Courier New" w:cs="Courier New"/>
+          <w:color w:val="8A5230"/>
+          <w:sz w:val="20"/>
+          <w:szCs w:val="20"/>
+        </w:rPr>
+        <w:t>.com</w:t>
+      </w:r>
+      <w:r>
+        <w:rPr>
+          <w:rFonts w:ascii="Courier New" w:eastAsia="Courier New" w:hAnsi="Courier New" w:cs="Courier New"/>
+          <w:color w:val="8A5230"/>
+          <w:sz w:val="20"/>
+          <w:szCs w:val="20"/>
+        </w:rPr>
+        <w:t>/admin</w:t>
       </w:r>
     </w:p>
     <w:p>
@@ -197,15 +233,9 @@
         <w:tblLook w:val="04A0" w:firstRow="1" w:lastRow="0" w:firstColumn="1" w:lastColumn="0" w:noHBand="0" w:noVBand="1"/>
       </w:tblPr>
       <w:tblGrid>
-        <w:gridCol w:w="9026"/>
+        <w:gridCol w:w="9628"/>
       </w:tblGrid>
       <w:tr>
-        <w:tblPrEx>
-          <w:tblCellMar>
-            <w:top w:w="0" w:type="dxa"/>
-            <w:bottom w:w="0" w:type="dxa"/>
-          </w:tblCellMar>
-        </w:tblPrEx>
         <w:tc>
           <w:tcPr>
             <w:tcW w:w="9026" w:type="dxa"/>
@@ -230,7 +260,41 @@
                 <w:sz w:val="20"/>
                 <w:szCs w:val="20"/>
               </w:rPr>
-              <w:t>[ Screenshot: The Collabria CMS login screen. ]</w:t>
+              <w:drawing>
+                <wp:inline distT="0" distB="0" distL="0" distR="0" wp14:anchorId="5C16939B" wp14:editId="69299898">
+                  <wp:extent cx="6120130" cy="5868035"/>
+                  <wp:effectExtent l="0" t="0" r="1270" b="0"/>
+                  <wp:docPr id="1715646810" name="Picture 1"/>
+                  <wp:cNvGraphicFramePr>
+                    <a:graphicFrameLocks xmlns:a="http://schemas.openxmlformats.org/drawingml/2006/main" noChangeAspect="1"/>
+                  </wp:cNvGraphicFramePr>
+                  <a:graphic xmlns:a="http://schemas.openxmlformats.org/drawingml/2006/main">
+                    <a:graphicData uri="http://schemas.openxmlformats.org/drawingml/2006/picture">
+                      <pic:pic xmlns:pic="http://schemas.openxmlformats.org/drawingml/2006/picture">
+                        <pic:nvPicPr>
+                          <pic:cNvPr id="1715646810" name=""/>
+                          <pic:cNvPicPr/>
+                        </pic:nvPicPr>
+                        <pic:blipFill>
+                          <a:blip r:embed="rId7"/>
+                          <a:stretch>
+                            <a:fillRect/>
+                          </a:stretch>
+                        </pic:blipFill>
+                        <pic:spPr>
+                          <a:xfrm>
+                            <a:off x="0" y="0"/>
+                            <a:ext cx="6120130" cy="5868035"/>
+                          </a:xfrm>
+                          <a:prstGeom prst="rect">
+                            <a:avLst/>
+                          </a:prstGeom>
+                        </pic:spPr>
+                      </pic:pic>
+                    </a:graphicData>
+                  </a:graphic>
+                </wp:inline>
+              </w:drawing>
             </w:r>
           </w:p>
         </w:tc>
@@ -268,7 +332,23 @@
           <w:sz w:val="22"/>
           <w:szCs w:val="22"/>
         </w:rPr>
-        <w:t>Go to https://collabria-astro.vercel.app/admin</w:t>
+        <w:t>Go to https://collabria</w:t>
+      </w:r>
+      <w:r>
+        <w:rPr>
+          <w:rFonts w:ascii="Arial" w:eastAsia="Arial" w:hAnsi="Arial" w:cs="Arial"/>
+          <w:sz w:val="22"/>
+          <w:szCs w:val="22"/>
+        </w:rPr>
+        <w:t>inc.com</w:t>
+      </w:r>
+      <w:r>
+        <w:rPr>
+          <w:rFonts w:ascii="Arial" w:eastAsia="Arial" w:hAnsi="Arial" w:cs="Arial"/>
+          <w:sz w:val="22"/>
+          <w:szCs w:val="22"/>
+        </w:rPr>
+        <w:t>/admin</w:t>
       </w:r>
     </w:p>
     <w:p>
@@ -322,6 +402,7 @@
           <w:sz w:val="22"/>
           <w:szCs w:val="22"/>
         </w:rPr>
+        <w:lastRenderedPageBreak/>
         <w:t>You will be returned to the dashboard automatically</w:t>
       </w:r>
     </w:p>
@@ -351,12 +432,6 @@
         <w:gridCol w:w="9026"/>
       </w:tblGrid>
       <w:tr>
-        <w:tblPrEx>
-          <w:tblCellMar>
-            <w:top w:w="0" w:type="dxa"/>
-            <w:bottom w:w="0" w:type="dxa"/>
-          </w:tblCellMar>
-        </w:tblPrEx>
         <w:tc>
           <w:tcPr>
             <w:tcW w:w="9026" w:type="dxa"/>
@@ -444,7 +519,7 @@
                     </pic:cNvPicPr>
                   </pic:nvPicPr>
                   <pic:blipFill>
-                    <a:blip r:embed="rId7"/>
+                    <a:blip r:embed="rId8"/>
                     <a:srcRect/>
                     <a:stretch>
                       <a:fillRect/>
@@ -539,7 +614,6 @@
     </w:p>
     <w:p>
       <w:r>
-        <w:lastRenderedPageBreak/>
         <w:br w:type="page"/>
       </w:r>
     </w:p>
@@ -610,15 +684,9 @@
         <w:tblLook w:val="04A0" w:firstRow="1" w:lastRow="0" w:firstColumn="1" w:lastColumn="0" w:noHBand="0" w:noVBand="1"/>
       </w:tblPr>
       <w:tblGrid>
-        <w:gridCol w:w="9026"/>
+        <w:gridCol w:w="9628"/>
       </w:tblGrid>
       <w:tr>
-        <w:tblPrEx>
-          <w:tblCellMar>
-            <w:top w:w="0" w:type="dxa"/>
-            <w:bottom w:w="0" w:type="dxa"/>
-          </w:tblCellMar>
-        </w:tblPrEx>
         <w:tc>
           <w:tcPr>
             <w:tcW w:w="9026" w:type="dxa"/>
@@ -643,7 +711,41 @@
                 <w:sz w:val="20"/>
                 <w:szCs w:val="20"/>
               </w:rPr>
-              <w:t>[ Screenshot: A case study open for editing. Left panel: fields. Right panel: live preview. ]</w:t>
+              <w:drawing>
+                <wp:inline distT="0" distB="0" distL="0" distR="0" wp14:anchorId="578E1DFF" wp14:editId="0221AB76">
+                  <wp:extent cx="6120130" cy="4051935"/>
+                  <wp:effectExtent l="0" t="0" r="1270" b="0"/>
+                  <wp:docPr id="412736361" name="Picture 1"/>
+                  <wp:cNvGraphicFramePr>
+                    <a:graphicFrameLocks xmlns:a="http://schemas.openxmlformats.org/drawingml/2006/main" noChangeAspect="1"/>
+                  </wp:cNvGraphicFramePr>
+                  <a:graphic xmlns:a="http://schemas.openxmlformats.org/drawingml/2006/main">
+                    <a:graphicData uri="http://schemas.openxmlformats.org/drawingml/2006/picture">
+                      <pic:pic xmlns:pic="http://schemas.openxmlformats.org/drawingml/2006/picture">
+                        <pic:nvPicPr>
+                          <pic:cNvPr id="412736361" name=""/>
+                          <pic:cNvPicPr/>
+                        </pic:nvPicPr>
+                        <pic:blipFill>
+                          <a:blip r:embed="rId9"/>
+                          <a:stretch>
+                            <a:fillRect/>
+                          </a:stretch>
+                        </pic:blipFill>
+                        <pic:spPr>
+                          <a:xfrm>
+                            <a:off x="0" y="0"/>
+                            <a:ext cx="6120130" cy="4051935"/>
+                          </a:xfrm>
+                          <a:prstGeom prst="rect">
+                            <a:avLst/>
+                          </a:prstGeom>
+                        </pic:spPr>
+                      </pic:pic>
+                    </a:graphicData>
+                  </a:graphic>
+                </wp:inline>
+              </w:drawing>
             </w:r>
           </w:p>
         </w:tc>
@@ -952,12 +1054,6 @@
         <w:gridCol w:w="9026"/>
       </w:tblGrid>
       <w:tr>
-        <w:tblPrEx>
-          <w:tblCellMar>
-            <w:top w:w="0" w:type="dxa"/>
-            <w:bottom w:w="0" w:type="dxa"/>
-          </w:tblCellMar>
-        </w:tblPrEx>
         <w:tc>
           <w:tcPr>
             <w:tcW w:w="9026" w:type="dxa"/>
@@ -1179,7 +1275,6 @@
           <w:sz w:val="22"/>
           <w:szCs w:val="22"/>
         </w:rPr>
-        <w:lastRenderedPageBreak/>
         <w:t>Confirm the deletion</w:t>
       </w:r>
     </w:p>
@@ -1209,12 +1304,6 @@
         <w:gridCol w:w="9026"/>
       </w:tblGrid>
       <w:tr>
-        <w:tblPrEx>
-          <w:tblCellMar>
-            <w:top w:w="0" w:type="dxa"/>
-            <w:bottom w:w="0" w:type="dxa"/>
-          </w:tblCellMar>
-        </w:tblPrEx>
         <w:tc>
           <w:tcPr>
             <w:tcW w:w="9026" w:type="dxa"/>
@@ -1317,15 +1406,9 @@
         <w:tblLook w:val="04A0" w:firstRow="1" w:lastRow="0" w:firstColumn="1" w:lastColumn="0" w:noHBand="0" w:noVBand="1"/>
       </w:tblPr>
       <w:tblGrid>
-        <w:gridCol w:w="9026"/>
+        <w:gridCol w:w="9628"/>
       </w:tblGrid>
       <w:tr>
-        <w:tblPrEx>
-          <w:tblCellMar>
-            <w:top w:w="0" w:type="dxa"/>
-            <w:bottom w:w="0" w:type="dxa"/>
-          </w:tblCellMar>
-        </w:tblPrEx>
         <w:tc>
           <w:tcPr>
             <w:tcW w:w="9026" w:type="dxa"/>
@@ -1350,7 +1433,41 @@
                 <w:sz w:val="20"/>
                 <w:szCs w:val="20"/>
               </w:rPr>
-              <w:t>[ Screenshot: The Site Data section — Client List, Homepage Quotes, and Services. ]</w:t>
+              <w:drawing>
+                <wp:inline distT="0" distB="0" distL="0" distR="0" wp14:anchorId="15932ADA" wp14:editId="49DFA82A">
+                  <wp:extent cx="6120130" cy="4014470"/>
+                  <wp:effectExtent l="0" t="0" r="1270" b="0"/>
+                  <wp:docPr id="1304240907" name="Picture 1"/>
+                  <wp:cNvGraphicFramePr>
+                    <a:graphicFrameLocks xmlns:a="http://schemas.openxmlformats.org/drawingml/2006/main" noChangeAspect="1"/>
+                  </wp:cNvGraphicFramePr>
+                  <a:graphic xmlns:a="http://schemas.openxmlformats.org/drawingml/2006/main">
+                    <a:graphicData uri="http://schemas.openxmlformats.org/drawingml/2006/picture">
+                      <pic:pic xmlns:pic="http://schemas.openxmlformats.org/drawingml/2006/picture">
+                        <pic:nvPicPr>
+                          <pic:cNvPr id="1304240907" name=""/>
+                          <pic:cNvPicPr/>
+                        </pic:nvPicPr>
+                        <pic:blipFill>
+                          <a:blip r:embed="rId10"/>
+                          <a:stretch>
+                            <a:fillRect/>
+                          </a:stretch>
+                        </pic:blipFill>
+                        <pic:spPr>
+                          <a:xfrm>
+                            <a:off x="0" y="0"/>
+                            <a:ext cx="6120130" cy="4014470"/>
+                          </a:xfrm>
+                          <a:prstGeom prst="rect">
+                            <a:avLst/>
+                          </a:prstGeom>
+                        </pic:spPr>
+                      </pic:pic>
+                    </a:graphicData>
+                  </a:graphic>
+                </wp:inline>
+              </w:drawing>
             </w:r>
           </w:p>
         </w:tc>
@@ -1817,7 +1934,6 @@
           <w:sz w:val="22"/>
           <w:szCs w:val="22"/>
         </w:rPr>
-        <w:lastRenderedPageBreak/>
         <w:t>How to open: Click "Site Data" → "Homepage Quotes"</w:t>
       </w:r>
     </w:p>
@@ -2094,6 +2210,7 @@
           <w:sz w:val="22"/>
           <w:szCs w:val="22"/>
         </w:rPr>
+        <w:lastRenderedPageBreak/>
         <w:t xml:space="preserve">LEAD SENTENCE: </w:t>
       </w:r>
       <w:r>
@@ -2224,12 +2341,6 @@
         <w:gridCol w:w="9026"/>
       </w:tblGrid>
       <w:tr>
-        <w:tblPrEx>
-          <w:tblCellMar>
-            <w:top w:w="0" w:type="dxa"/>
-            <w:bottom w:w="0" w:type="dxa"/>
-          </w:tblCellMar>
-        </w:tblPrEx>
         <w:tc>
           <w:tcPr>
             <w:tcW w:w="9026" w:type="dxa"/>
@@ -2462,12 +2573,6 @@
         <w:gridCol w:w="7672"/>
       </w:tblGrid>
       <w:tr>
-        <w:tblPrEx>
-          <w:tblCellMar>
-            <w:top w:w="0" w:type="dxa"/>
-            <w:bottom w:w="0" w:type="dxa"/>
-          </w:tblCellMar>
-        </w:tblPrEx>
         <w:tc>
           <w:tcPr>
             <w:tcW w:w="1354" w:type="dxa"/>
@@ -2516,12 +2621,6 @@
         </w:tc>
       </w:tr>
       <w:tr>
-        <w:tblPrEx>
-          <w:tblCellMar>
-            <w:top w:w="0" w:type="dxa"/>
-            <w:bottom w:w="0" w:type="dxa"/>
-          </w:tblCellMar>
-        </w:tblPrEx>
         <w:tc>
           <w:tcPr>
             <w:tcW w:w="1354" w:type="dxa"/>
@@ -4763,7 +4862,7 @@
         <w:rPr>
           <w:noProof/>
         </w:rPr>
-        <w:pict w14:anchorId="51763C47">
+        <w:pict w14:anchorId="3C15E7F9">
           <v:rect id="_x0000_i1031" alt="" style="width:451.3pt;height:.05pt;mso-width-percent:0;mso-height-percent:0;mso-width-percent:0;mso-height-percent:0" o:hralign="center" o:hrstd="t" o:hr="t" fillcolor="#a0a0a0" stroked="f"/>
         </w:pict>
       </w:r>
@@ -4780,16 +4879,7 @@
           <w:bCs/>
           <w:color w:val="8A5230"/>
         </w:rPr>
-        <w:t xml:space="preserve">The </w:t>
-      </w:r>
-      <w:r>
-        <w:rPr>
-          <w:rFonts w:ascii="Arial" w:eastAsia="Arial" w:hAnsi="Arial" w:cs="Arial"/>
-          <w:b/>
-          <w:bCs/>
-          <w:color w:val="8A5230"/>
-        </w:rPr>
-        <w:t>CMS</w:t>
+        <w:t>The CMS</w:t>
       </w:r>
     </w:p>
     <w:p>
@@ -6369,7 +6459,7 @@
         <w:rPr>
           <w:noProof/>
         </w:rPr>
-        <w:pict w14:anchorId="23644AE2">
+        <w:pict w14:anchorId="7D534C8C">
           <v:rect id="_x0000_i1030" alt="" style="width:451.3pt;height:.05pt;mso-width-percent:0;mso-height-percent:0;mso-width-percent:0;mso-height-percent:0" o:hralign="center" o:hrstd="t" o:hr="t" fillcolor="#a0a0a0" stroked="f"/>
         </w:pict>
       </w:r>
@@ -6386,16 +6476,7 @@
           <w:bCs/>
           <w:color w:val="8A5230"/>
         </w:rPr>
-        <w:t xml:space="preserve">The </w:t>
-      </w:r>
-      <w:r>
-        <w:rPr>
-          <w:rFonts w:ascii="Arial" w:eastAsia="Arial" w:hAnsi="Arial" w:cs="Arial"/>
-          <w:b/>
-          <w:bCs/>
-          <w:color w:val="8A5230"/>
-        </w:rPr>
-        <w:t>Hosting</w:t>
+        <w:t>The Hosting</w:t>
       </w:r>
     </w:p>
     <w:p>
@@ -7019,7 +7100,7 @@
         <w:rPr>
           <w:noProof/>
         </w:rPr>
-        <w:pict w14:anchorId="1C3D688B">
+        <w:pict w14:anchorId="62A44083">
           <v:rect id="_x0000_i1029" alt="" style="width:451.3pt;height:.05pt;mso-width-percent:0;mso-height-percent:0;mso-width-percent:0;mso-height-percent:0" o:hralign="center" o:hrstd="t" o:hr="t" fillcolor="#a0a0a0" stroked="f"/>
         </w:pict>
       </w:r>
@@ -7036,16 +7117,7 @@
           <w:bCs/>
           <w:color w:val="8A5230"/>
         </w:rPr>
-        <w:t>The</w:t>
-      </w:r>
-      <w:r>
-        <w:rPr>
-          <w:rFonts w:ascii="Arial" w:eastAsia="Arial" w:hAnsi="Arial" w:cs="Arial"/>
-          <w:b/>
-          <w:bCs/>
-          <w:color w:val="8A5230"/>
-        </w:rPr>
-        <w:t xml:space="preserve"> Full Flow when publishing a Page</w:t>
+        <w:t>The Full Flow when publishing a Page</w:t>
       </w:r>
     </w:p>
     <w:p>
@@ -7361,7 +7433,7 @@
           <w:color w:val="3B1A0C"/>
         </w:rPr>
         <w:lastRenderedPageBreak/>
-        <w:t xml:space="preserve">Appendix </w:t>
+        <w:t xml:space="preserve">Appendix 2: How to </w:t>
       </w:r>
       <w:r>
         <w:rPr>
@@ -7370,33 +7442,6 @@
           <w:bCs/>
           <w:color w:val="3B1A0C"/>
         </w:rPr>
-        <w:t>2</w:t>
-      </w:r>
-      <w:r>
-        <w:rPr>
-          <w:rFonts w:ascii="Arial" w:eastAsia="Arial" w:hAnsi="Arial" w:cs="Arial"/>
-          <w:b/>
-          <w:bCs/>
-          <w:color w:val="3B1A0C"/>
-        </w:rPr>
-        <w:t xml:space="preserve">: </w:t>
-      </w:r>
-      <w:r>
-        <w:rPr>
-          <w:rFonts w:ascii="Arial" w:eastAsia="Arial" w:hAnsi="Arial" w:cs="Arial"/>
-          <w:b/>
-          <w:bCs/>
-          <w:color w:val="3B1A0C"/>
-        </w:rPr>
-        <w:t xml:space="preserve">How to </w:t>
-      </w:r>
-      <w:r>
-        <w:rPr>
-          <w:rFonts w:ascii="Arial" w:eastAsia="Arial" w:hAnsi="Arial" w:cs="Arial"/>
-          <w:b/>
-          <w:bCs/>
-          <w:color w:val="3B1A0C"/>
-        </w:rPr>
         <w:t>publish the site to www.collabriainc.com</w:t>
       </w:r>
     </w:p>
@@ -7413,7 +7458,7 @@
         <w:rPr>
           <w:noProof/>
         </w:rPr>
-        <w:pict w14:anchorId="1381F93C">
+        <w:pict w14:anchorId="23F0E928">
           <v:rect id="_x0000_i1028" alt="" style="width:451.3pt;height:.05pt;mso-width-percent:0;mso-height-percent:0;mso-width-percent:0;mso-height-percent:0" o:hralign="center" o:hrstd="t" o:hr="t" fillcolor="#a0a0a0" stroked="f"/>
         </w:pict>
       </w:r>
@@ -7519,7 +7564,7 @@
         <w:rPr>
           <w:noProof/>
         </w:rPr>
-        <w:pict w14:anchorId="132B3A40">
+        <w:pict w14:anchorId="57501C50">
           <v:rect id="_x0000_i1027" alt="" style="width:451.3pt;height:.05pt;mso-width-percent:0;mso-height-percent:0;mso-width-percent:0;mso-height-percent:0" o:hralign="center" o:hrstd="t" o:hr="t" fillcolor="#a0a0a0" stroked="f"/>
         </w:pict>
       </w:r>
@@ -7536,34 +7581,7 @@
           <w:bCs/>
           <w:color w:val="8A5230"/>
         </w:rPr>
-        <w:t xml:space="preserve">Step </w:t>
-      </w:r>
-      <w:r>
-        <w:rPr>
-          <w:rFonts w:ascii="Arial" w:eastAsia="Arial" w:hAnsi="Arial" w:cs="Arial"/>
-          <w:b/>
-          <w:bCs/>
-          <w:color w:val="8A5230"/>
-        </w:rPr>
-        <w:t>2</w:t>
-      </w:r>
-      <w:r>
-        <w:rPr>
-          <w:rFonts w:ascii="Arial" w:eastAsia="Arial" w:hAnsi="Arial" w:cs="Arial"/>
-          <w:b/>
-          <w:bCs/>
-          <w:color w:val="8A5230"/>
-        </w:rPr>
-        <w:t xml:space="preserve"> - </w:t>
-      </w:r>
-      <w:r>
-        <w:rPr>
-          <w:rFonts w:ascii="Arial" w:eastAsia="Arial" w:hAnsi="Arial" w:cs="Arial"/>
-          <w:b/>
-          <w:bCs/>
-          <w:color w:val="8A5230"/>
-        </w:rPr>
-        <w:t>Update DNS in IONOS</w:t>
+        <w:t>Step 2 - Update DNS in IONOS</w:t>
       </w:r>
     </w:p>
     <w:p>
@@ -7577,7 +7595,7 @@
       <w:r>
         <w:t xml:space="preserve">Log in at </w:t>
       </w:r>
-      <w:hyperlink r:id="rId8" w:history="1">
+      <w:hyperlink r:id="rId11" w:history="1">
         <w:r>
           <w:rPr>
             <w:color w:val="0000FF"/>
@@ -7972,7 +7990,7 @@
         <w:rPr>
           <w:noProof/>
         </w:rPr>
-        <w:pict w14:anchorId="0DE2BB50">
+        <w:pict w14:anchorId="2B0FE058">
           <v:rect id="_x0000_i1026" alt="" style="width:451.3pt;height:.05pt;mso-width-percent:0;mso-height-percent:0;mso-width-percent:0;mso-height-percent:0" o:hralign="center" o:hrstd="t" o:hr="t" fillcolor="#a0a0a0" stroked="f"/>
         </w:pict>
       </w:r>
@@ -7989,8 +8007,52 @@
           <w:bCs/>
           <w:color w:val="8A5230"/>
         </w:rPr>
-        <w:t xml:space="preserve">Step </w:t>
-      </w:r>
+        <w:t>Step 3 - Wait</w:t>
+      </w:r>
+    </w:p>
+    <w:p>
+      <w:pPr>
+        <w:spacing w:before="100" w:beforeAutospacing="1" w:after="100" w:afterAutospacing="1"/>
+      </w:pPr>
+      <w:r>
+        <w:t xml:space="preserve">Propagation with IONOS typically takes </w:t>
+      </w:r>
+      <w:r>
+        <w:rPr>
+          <w:b/>
+          <w:bCs/>
+        </w:rPr>
+        <w:t>15–60 minutes</w:t>
+      </w:r>
+      <w:r>
+        <w:t xml:space="preserve">. Vercel will automatically issue the SSL certificate once it detects the domain. You can monitor status in Vercel under </w:t>
+      </w:r>
+      <w:r>
+        <w:rPr>
+          <w:b/>
+          <w:bCs/>
+        </w:rPr>
+        <w:t>Settings → Domains</w:t>
+      </w:r>
+      <w:r>
+        <w:t xml:space="preserve"> — it will show a green checkmark when active.</w:t>
+      </w:r>
+    </w:p>
+    <w:p>
+      <w:r>
+        <w:rPr>
+          <w:noProof/>
+        </w:rPr>
+        <w:pict w14:anchorId="052085CC">
+          <v:rect id="_x0000_i1025" alt="" style="width:451.3pt;height:.05pt;mso-width-percent:0;mso-height-percent:0;mso-width-percent:0;mso-height-percent:0" o:hralign="center" o:hrstd="t" o:hr="t" fillcolor="#a0a0a0" stroked="f"/>
+        </w:pict>
+      </w:r>
+    </w:p>
+    <w:p>
+      <w:pPr>
+        <w:pStyle w:val="Heading2"/>
+        <w:spacing w:before="280" w:after="120"/>
+      </w:pPr>
       <w:r>
         <w:rPr>
           <w:rFonts w:ascii="Arial" w:eastAsia="Arial" w:hAnsi="Arial" w:cs="Arial"/>
@@ -7998,105 +8060,7 @@
           <w:bCs/>
           <w:color w:val="8A5230"/>
         </w:rPr>
-        <w:t>3</w:t>
-      </w:r>
-      <w:r>
-        <w:rPr>
-          <w:rFonts w:ascii="Arial" w:eastAsia="Arial" w:hAnsi="Arial" w:cs="Arial"/>
-          <w:b/>
-          <w:bCs/>
-          <w:color w:val="8A5230"/>
-        </w:rPr>
-        <w:t xml:space="preserve"> - </w:t>
-      </w:r>
-      <w:r>
-        <w:rPr>
-          <w:rFonts w:ascii="Arial" w:eastAsia="Arial" w:hAnsi="Arial" w:cs="Arial"/>
-          <w:b/>
-          <w:bCs/>
-          <w:color w:val="8A5230"/>
-        </w:rPr>
-        <w:t>Wait</w:t>
-      </w:r>
-    </w:p>
-    <w:p>
-      <w:pPr>
-        <w:spacing w:before="100" w:beforeAutospacing="1" w:after="100" w:afterAutospacing="1"/>
-      </w:pPr>
-      <w:r>
-        <w:t xml:space="preserve">Propagation with IONOS typically takes </w:t>
-      </w:r>
-      <w:r>
-        <w:rPr>
-          <w:b/>
-          <w:bCs/>
-        </w:rPr>
-        <w:t>15–60 minutes</w:t>
-      </w:r>
-      <w:r>
-        <w:t xml:space="preserve">. Vercel will automatically issue the SSL certificate once it detects the domain. You can monitor status in Vercel under </w:t>
-      </w:r>
-      <w:r>
-        <w:rPr>
-          <w:b/>
-          <w:bCs/>
-        </w:rPr>
-        <w:t>Settings → Domains</w:t>
-      </w:r>
-      <w:r>
-        <w:t xml:space="preserve"> — it will show a green checkmark when active.</w:t>
-      </w:r>
-    </w:p>
-    <w:p>
-      <w:r>
-        <w:rPr>
-          <w:noProof/>
-        </w:rPr>
-        <w:pict w14:anchorId="71D78400">
-          <v:rect id="_x0000_i1025" alt="" style="width:451.3pt;height:.05pt;mso-width-percent:0;mso-height-percent:0;mso-width-percent:0;mso-height-percent:0" o:hralign="center" o:hrstd="t" o:hr="t" fillcolor="#a0a0a0" stroked="f"/>
-        </w:pict>
-      </w:r>
-    </w:p>
-    <w:p>
-      <w:pPr>
-        <w:pStyle w:val="Heading2"/>
-        <w:spacing w:before="280" w:after="120"/>
-      </w:pPr>
-      <w:r>
-        <w:rPr>
-          <w:rFonts w:ascii="Arial" w:eastAsia="Arial" w:hAnsi="Arial" w:cs="Arial"/>
-          <w:b/>
-          <w:bCs/>
-          <w:color w:val="8A5230"/>
-        </w:rPr>
-        <w:t xml:space="preserve">Step </w:t>
-      </w:r>
-      <w:r>
-        <w:rPr>
-          <w:rFonts w:ascii="Arial" w:eastAsia="Arial" w:hAnsi="Arial" w:cs="Arial"/>
-          <w:b/>
-          <w:bCs/>
-          <w:color w:val="8A5230"/>
-        </w:rPr>
-        <w:t>4</w:t>
-      </w:r>
-      <w:r>
-        <w:rPr>
-          <w:rFonts w:ascii="Arial" w:eastAsia="Arial" w:hAnsi="Arial" w:cs="Arial"/>
-          <w:b/>
-          <w:bCs/>
-          <w:color w:val="8A5230"/>
-        </w:rPr>
-        <w:t xml:space="preserve"> - </w:t>
-      </w:r>
-      <w:r>
-        <w:rPr>
-          <w:rFonts w:ascii="Arial" w:eastAsia="Arial" w:hAnsi="Arial" w:cs="Arial"/>
-          <w:b/>
-          <w:bCs/>
-          <w:color w:val="8A5230"/>
-        </w:rPr>
-        <w:t>After it goes live, run these two updates</w:t>
+        <w:t>Step 4 - After it goes live, run these two updates</w:t>
       </w:r>
     </w:p>
     <w:p>
@@ -8170,7 +8134,7 @@
       <w:r>
         <w:t xml:space="preserve"> → </w:t>
       </w:r>
-      <w:hyperlink r:id="rId9" w:history="1">
+      <w:hyperlink r:id="rId12" w:history="1">
         <w:r>
           <w:rPr>
             <w:color w:val="0000FF"/>
@@ -8298,7 +8262,7 @@
       </w:r>
     </w:p>
     <w:sectPr>
-      <w:footerReference w:type="default" r:id="rId10"/>
+      <w:footerReference w:type="default" r:id="rId13"/>
       <w:pgSz w:w="11906" w:h="16838"/>
       <w:pgMar w:top="1134" w:right="1134" w:bottom="1134" w:left="1134" w:header="708" w:footer="708" w:gutter="0"/>
       <w:cols w:space="720"/>
@@ -8309,7 +8273,7 @@
 </file>
 
 <file path=word/endnotes.xml><?xml version="1.0" encoding="utf-8"?>
-<w:endnotes xmlns:wpc="http://schemas.microsoft.com/office/word/2010/wordprocessingCanvas" xmlns:cx="http://schemas.microsoft.com/office/drawing/2014/chartex" xmlns:cx1="http://schemas.microsoft.com/office/drawing/2015/9/8/chartex" xmlns:cx2="http://schemas.microsoft.com/office/drawing/2015/10/21/chartex" xmlns:cx3="http://schemas.microsoft.com/office/drawing/2016/5/9/chartex" xmlns:cx4="http://schemas.microsoft.com/office/drawing/2016/5/10/chartex" xmlns:cx5="http://schemas.microsoft.com/office/drawing/2016/5/11/chartex" xmlns:cx6="http://schemas.microsoft.com/office/drawing/2016/5/12/chartex" xmlns:cx7="http://schemas.microsoft.com/office/drawing/2016/5/13/chartex" xmlns:cx8="http://schemas.microsoft.com/office/drawing/2016/5/14/chartex" xmlns:mc="http://schemas.openxmlformats.org/markup-compatibility/2006" xmlns:aink="http://schemas.microsoft.com/office/drawing/2016/ink" xmlns:am3d="http://schemas.microsoft.com/office/drawing/2017/model3d" xmlns:o="urn:schemas-microsoft-com:office:office" xmlns:oel="http://schemas.microsoft.com/office/2019/extlst" xmlns:r="http://schemas.openxmlformats.org/officeDocument/2006/relationships" xmlns:m="http://schemas.openxmlformats.org/officeDocument/2006/math" xmlns:v="urn:schemas-microsoft-com:vml" xmlns:wp14="http://schemas.microsoft.com/office/word/2010/wordprocessingDrawing" xmlns:wp="http://schemas.openxmlformats.org/drawingml/2006/wordprocessingDrawing" xmlns:w10="urn:schemas-microsoft-com:office:word" xmlns:w="http://schemas.openxmlformats.org/wordprocessingml/2006/main" xmlns:w14="http://schemas.microsoft.com/office/word/2010/wordml" xmlns:w15="http://schemas.microsoft.com/office/word/2012/wordml" xmlns:w16cex="http://schemas.microsoft.com/office/word/2018/wordml/cex" xmlns:w16cid="http://schemas.microsoft.com/office/word/2016/wordml/cid" xmlns:w16="http://schemas.microsoft.com/office/word/2018/wordml" xmlns:w16du="http://schemas.microsoft.com/office/word/2023/wordml/word16du" xmlns:w16sdtdh="http://schemas.microsoft.com/office/word/2020/wordml/sdtdatahash" xmlns:w16sdtfl="http://schemas.microsoft.com/office/word/2024/wordml/sdtformatlock" xmlns:w16se="http://schemas.microsoft.com/office/word/2015/wordml/symex" xmlns:wpg="http://schemas.microsoft.com/office/word/2010/wordprocessingGroup" xmlns:wpi="http://schemas.microsoft.com/office/word/2010/wordprocessingInk" xmlns:wne="http://schemas.microsoft.com/office/word/2006/wordml" xmlns:wps="http://schemas.microsoft.com/office/word/2010/wordprocessingShape" mc:Ignorable="w14 w15 w16se w16cid w16 w16cex w16sdtdh w16sdtfl w16du wp14">
+<w:endnotes xmlns:wpc="http://schemas.microsoft.com/office/word/2010/wordprocessingCanvas" xmlns:cx="http://schemas.microsoft.com/office/drawing/2014/chartex" xmlns:cx1="http://schemas.microsoft.com/office/drawing/2015/9/8/chartex" xmlns:cx2="http://schemas.microsoft.com/office/drawing/2015/10/21/chartex" xmlns:cx3="http://schemas.microsoft.com/office/drawing/2016/5/9/chartex" xmlns:cx4="http://schemas.microsoft.com/office/drawing/2016/5/10/chartex" xmlns:cx5="http://schemas.microsoft.com/office/drawing/2016/5/11/chartex" xmlns:cx6="http://schemas.microsoft.com/office/drawing/2016/5/12/chartex" xmlns:cx7="http://schemas.microsoft.com/office/drawing/2016/5/13/chartex" xmlns:cx8="http://schemas.microsoft.com/office/drawing/2016/5/14/chartex" xmlns:mc="http://schemas.openxmlformats.org/markup-compatibility/2006" xmlns:m="http://schemas.openxmlformats.org/officeDocument/2006/math" xmlns:aink="http://schemas.microsoft.com/office/drawing/2016/ink" xmlns:am3d="http://schemas.microsoft.com/office/drawing/2017/model3d" xmlns:oel="http://schemas.microsoft.com/office/2019/extlst" xmlns:r="http://schemas.openxmlformats.org/officeDocument/2006/relationships" xmlns:wp14="http://schemas.microsoft.com/office/word/2010/wordprocessingDrawing" xmlns:wp="http://schemas.openxmlformats.org/drawingml/2006/wordprocessingDrawing" xmlns:wpg="http://schemas.microsoft.com/office/word/2010/wordprocessingGroup" xmlns:wpi="http://schemas.microsoft.com/office/word/2010/wordprocessingInk" xmlns:wps="http://schemas.microsoft.com/office/word/2010/wordprocessingShape" xmlns:o="urn:schemas-microsoft-com:office:office" xmlns:v="urn:schemas-microsoft-com:vml" xmlns:w10="urn:schemas-microsoft-com:office:word" xmlns:w="http://schemas.openxmlformats.org/wordprocessingml/2006/main" xmlns:w14="http://schemas.microsoft.com/office/word/2010/wordml" xmlns:w15="http://schemas.microsoft.com/office/word/2012/wordml" xmlns:w16cex="http://schemas.microsoft.com/office/word/2018/wordml/cex" xmlns:w16cid="http://schemas.microsoft.com/office/word/2016/wordml/cid" xmlns:w16="http://schemas.microsoft.com/office/word/2018/wordml" xmlns:w16sdtdh="http://schemas.microsoft.com/office/word/2020/wordml/sdtdatahash" xmlns:w16sdtfl="http://schemas.microsoft.com/office/word/2024/wordml/sdtformatlock" xmlns:w16se="http://schemas.microsoft.com/office/word/2015/wordml/symex" xmlns:w16du="http://schemas.microsoft.com/office/word/2023/wordml/word16du" xmlns:wne="http://schemas.microsoft.com/office/word/2006/wordml" mc:Ignorable="w14 w15 w16se w16cid w16 w16cex w16sdtdh w16sdtfl w16du wp14">
   <w:endnote w:type="separator" w:id="-1">
     <w:p>
       <w:r>
@@ -8328,7 +8292,7 @@
 </file>
 
 <file path=word/footer1.xml><?xml version="1.0" encoding="utf-8"?>
-<w:ftr xmlns:wpc="http://schemas.microsoft.com/office/word/2010/wordprocessingCanvas" xmlns:cx="http://schemas.microsoft.com/office/drawing/2014/chartex" xmlns:cx1="http://schemas.microsoft.com/office/drawing/2015/9/8/chartex" xmlns:cx2="http://schemas.microsoft.com/office/drawing/2015/10/21/chartex" xmlns:cx3="http://schemas.microsoft.com/office/drawing/2016/5/9/chartex" xmlns:cx4="http://schemas.microsoft.com/office/drawing/2016/5/10/chartex" xmlns:cx5="http://schemas.microsoft.com/office/drawing/2016/5/11/chartex" xmlns:cx6="http://schemas.microsoft.com/office/drawing/2016/5/12/chartex" xmlns:cx7="http://schemas.microsoft.com/office/drawing/2016/5/13/chartex" xmlns:cx8="http://schemas.microsoft.com/office/drawing/2016/5/14/chartex" xmlns:mc="http://schemas.openxmlformats.org/markup-compatibility/2006" xmlns:aink="http://schemas.microsoft.com/office/drawing/2016/ink" xmlns:am3d="http://schemas.microsoft.com/office/drawing/2017/model3d" xmlns:o="urn:schemas-microsoft-com:office:office" xmlns:oel="http://schemas.microsoft.com/office/2019/extlst" xmlns:r="http://schemas.openxmlformats.org/officeDocument/2006/relationships" xmlns:m="http://schemas.openxmlformats.org/officeDocument/2006/math" xmlns:v="urn:schemas-microsoft-com:vml" xmlns:wp14="http://schemas.microsoft.com/office/word/2010/wordprocessingDrawing" xmlns:wp="http://schemas.openxmlformats.org/drawingml/2006/wordprocessingDrawing" xmlns:w10="urn:schemas-microsoft-com:office:word" xmlns:w="http://schemas.openxmlformats.org/wordprocessingml/2006/main" xmlns:w14="http://schemas.microsoft.com/office/word/2010/wordml" xmlns:w15="http://schemas.microsoft.com/office/word/2012/wordml" xmlns:w16cex="http://schemas.microsoft.com/office/word/2018/wordml/cex" xmlns:w16cid="http://schemas.microsoft.com/office/word/2016/wordml/cid" xmlns:w16="http://schemas.microsoft.com/office/word/2018/wordml" xmlns:w16du="http://schemas.microsoft.com/office/word/2023/wordml/word16du" xmlns:w16sdtdh="http://schemas.microsoft.com/office/word/2020/wordml/sdtdatahash" xmlns:w16sdtfl="http://schemas.microsoft.com/office/word/2024/wordml/sdtformatlock" xmlns:w16se="http://schemas.microsoft.com/office/word/2015/wordml/symex" xmlns:wpg="http://schemas.microsoft.com/office/word/2010/wordprocessingGroup" xmlns:wpi="http://schemas.microsoft.com/office/word/2010/wordprocessingInk" xmlns:wne="http://schemas.microsoft.com/office/word/2006/wordml" xmlns:wps="http://schemas.microsoft.com/office/word/2010/wordprocessingShape" mc:Ignorable="w14 w15 w16se w16cid w16 w16cex w16sdtdh w16sdtfl w16du wp14">
+<w:ftr xmlns:wpc="http://schemas.microsoft.com/office/word/2010/wordprocessingCanvas" xmlns:cx="http://schemas.microsoft.com/office/drawing/2014/chartex" xmlns:cx1="http://schemas.microsoft.com/office/drawing/2015/9/8/chartex" xmlns:cx2="http://schemas.microsoft.com/office/drawing/2015/10/21/chartex" xmlns:cx3="http://schemas.microsoft.com/office/drawing/2016/5/9/chartex" xmlns:cx4="http://schemas.microsoft.com/office/drawing/2016/5/10/chartex" xmlns:cx5="http://schemas.microsoft.com/office/drawing/2016/5/11/chartex" xmlns:cx6="http://schemas.microsoft.com/office/drawing/2016/5/12/chartex" xmlns:cx7="http://schemas.microsoft.com/office/drawing/2016/5/13/chartex" xmlns:cx8="http://schemas.microsoft.com/office/drawing/2016/5/14/chartex" xmlns:mc="http://schemas.openxmlformats.org/markup-compatibility/2006" xmlns:m="http://schemas.openxmlformats.org/officeDocument/2006/math" xmlns:aink="http://schemas.microsoft.com/office/drawing/2016/ink" xmlns:am3d="http://schemas.microsoft.com/office/drawing/2017/model3d" xmlns:oel="http://schemas.microsoft.com/office/2019/extlst" xmlns:r="http://schemas.openxmlformats.org/officeDocument/2006/relationships" xmlns:wp14="http://schemas.microsoft.com/office/word/2010/wordprocessingDrawing" xmlns:wp="http://schemas.openxmlformats.org/drawingml/2006/wordprocessingDrawing" xmlns:wpg="http://schemas.microsoft.com/office/word/2010/wordprocessingGroup" xmlns:wpi="http://schemas.microsoft.com/office/word/2010/wordprocessingInk" xmlns:wps="http://schemas.microsoft.com/office/word/2010/wordprocessingShape" xmlns:o="urn:schemas-microsoft-com:office:office" xmlns:v="urn:schemas-microsoft-com:vml" xmlns:w10="urn:schemas-microsoft-com:office:word" xmlns:w="http://schemas.openxmlformats.org/wordprocessingml/2006/main" xmlns:w14="http://schemas.microsoft.com/office/word/2010/wordml" xmlns:w15="http://schemas.microsoft.com/office/word/2012/wordml" xmlns:w16cex="http://schemas.microsoft.com/office/word/2018/wordml/cex" xmlns:w16cid="http://schemas.microsoft.com/office/word/2016/wordml/cid" xmlns:w16="http://schemas.microsoft.com/office/word/2018/wordml" xmlns:w16sdtdh="http://schemas.microsoft.com/office/word/2020/wordml/sdtdatahash" xmlns:w16sdtfl="http://schemas.microsoft.com/office/word/2024/wordml/sdtformatlock" xmlns:w16se="http://schemas.microsoft.com/office/word/2015/wordml/symex" xmlns:w16du="http://schemas.microsoft.com/office/word/2023/wordml/word16du" xmlns:wne="http://schemas.microsoft.com/office/word/2006/wordml" mc:Ignorable="w14 w15 w16se w16cid w16 w16cex w16sdtdh w16sdtfl w16du wp14">
   <w:p>
     <w:pPr>
       <w:pBdr>
@@ -8397,7 +8361,7 @@
 </file>
 
 <file path=word/footnotes.xml><?xml version="1.0" encoding="utf-8"?>
-<w:footnotes xmlns:wpc="http://schemas.microsoft.com/office/word/2010/wordprocessingCanvas" xmlns:cx="http://schemas.microsoft.com/office/drawing/2014/chartex" xmlns:cx1="http://schemas.microsoft.com/office/drawing/2015/9/8/chartex" xmlns:cx2="http://schemas.microsoft.com/office/drawing/2015/10/21/chartex" xmlns:cx3="http://schemas.microsoft.com/office/drawing/2016/5/9/chartex" xmlns:cx4="http://schemas.microsoft.com/office/drawing/2016/5/10/chartex" xmlns:cx5="http://schemas.microsoft.com/office/drawing/2016/5/11/chartex" xmlns:cx6="http://schemas.microsoft.com/office/drawing/2016/5/12/chartex" xmlns:cx7="http://schemas.microsoft.com/office/drawing/2016/5/13/chartex" xmlns:cx8="http://schemas.microsoft.com/office/drawing/2016/5/14/chartex" xmlns:mc="http://schemas.openxmlformats.org/markup-compatibility/2006" xmlns:aink="http://schemas.microsoft.com/office/drawing/2016/ink" xmlns:am3d="http://schemas.microsoft.com/office/drawing/2017/model3d" xmlns:o="urn:schemas-microsoft-com:office:office" xmlns:oel="http://schemas.microsoft.com/office/2019/extlst" xmlns:r="http://schemas.openxmlformats.org/officeDocument/2006/relationships" xmlns:m="http://schemas.openxmlformats.org/officeDocument/2006/math" xmlns:v="urn:schemas-microsoft-com:vml" xmlns:wp14="http://schemas.microsoft.com/office/word/2010/wordprocessingDrawing" xmlns:wp="http://schemas.openxmlformats.org/drawingml/2006/wordprocessingDrawing" xmlns:w10="urn:schemas-microsoft-com:office:word" xmlns:w="http://schemas.openxmlformats.org/wordprocessingml/2006/main" xmlns:w14="http://schemas.microsoft.com/office/word/2010/wordml" xmlns:w15="http://schemas.microsoft.com/office/word/2012/wordml" xmlns:w16cex="http://schemas.microsoft.com/office/word/2018/wordml/cex" xmlns:w16cid="http://schemas.microsoft.com/office/word/2016/wordml/cid" xmlns:w16="http://schemas.microsoft.com/office/word/2018/wordml" xmlns:w16du="http://schemas.microsoft.com/office/word/2023/wordml/word16du" xmlns:w16sdtdh="http://schemas.microsoft.com/office/word/2020/wordml/sdtdatahash" xmlns:w16sdtfl="http://schemas.microsoft.com/office/word/2024/wordml/sdtformatlock" xmlns:w16se="http://schemas.microsoft.com/office/word/2015/wordml/symex" xmlns:wpg="http://schemas.microsoft.com/office/word/2010/wordprocessingGroup" xmlns:wpi="http://schemas.microsoft.com/office/word/2010/wordprocessingInk" xmlns:wne="http://schemas.microsoft.com/office/word/2006/wordml" xmlns:wps="http://schemas.microsoft.com/office/word/2010/wordprocessingShape" mc:Ignorable="w14 w15 w16se w16cid w16 w16cex w16sdtdh w16sdtfl w16du wp14">
+<w:footnotes xmlns:wpc="http://schemas.microsoft.com/office/word/2010/wordprocessingCanvas" xmlns:cx="http://schemas.microsoft.com/office/drawing/2014/chartex" xmlns:cx1="http://schemas.microsoft.com/office/drawing/2015/9/8/chartex" xmlns:cx2="http://schemas.microsoft.com/office/drawing/2015/10/21/chartex" xmlns:cx3="http://schemas.microsoft.com/office/drawing/2016/5/9/chartex" xmlns:cx4="http://schemas.microsoft.com/office/drawing/2016/5/10/chartex" xmlns:cx5="http://schemas.microsoft.com/office/drawing/2016/5/11/chartex" xmlns:cx6="http://schemas.microsoft.com/office/drawing/2016/5/12/chartex" xmlns:cx7="http://schemas.microsoft.com/office/drawing/2016/5/13/chartex" xmlns:cx8="http://schemas.microsoft.com/office/drawing/2016/5/14/chartex" xmlns:mc="http://schemas.openxmlformats.org/markup-compatibility/2006" xmlns:m="http://schemas.openxmlformats.org/officeDocument/2006/math" xmlns:aink="http://schemas.microsoft.com/office/drawing/2016/ink" xmlns:am3d="http://schemas.microsoft.com/office/drawing/2017/model3d" xmlns:oel="http://schemas.microsoft.com/office/2019/extlst" xmlns:r="http://schemas.openxmlformats.org/officeDocument/2006/relationships" xmlns:wp14="http://schemas.microsoft.com/office/word/2010/wordprocessingDrawing" xmlns:wp="http://schemas.openxmlformats.org/drawingml/2006/wordprocessingDrawing" xmlns:wpg="http://schemas.microsoft.com/office/word/2010/wordprocessingGroup" xmlns:wpi="http://schemas.microsoft.com/office/word/2010/wordprocessingInk" xmlns:wps="http://schemas.microsoft.com/office/word/2010/wordprocessingShape" xmlns:o="urn:schemas-microsoft-com:office:office" xmlns:v="urn:schemas-microsoft-com:vml" xmlns:w10="urn:schemas-microsoft-com:office:word" xmlns:w="http://schemas.openxmlformats.org/wordprocessingml/2006/main" xmlns:w14="http://schemas.microsoft.com/office/word/2010/wordml" xmlns:w15="http://schemas.microsoft.com/office/word/2012/wordml" xmlns:w16cex="http://schemas.microsoft.com/office/word/2018/wordml/cex" xmlns:w16cid="http://schemas.microsoft.com/office/word/2016/wordml/cid" xmlns:w16="http://schemas.microsoft.com/office/word/2018/wordml" xmlns:w16sdtdh="http://schemas.microsoft.com/office/word/2020/wordml/sdtdatahash" xmlns:w16sdtfl="http://schemas.microsoft.com/office/word/2024/wordml/sdtformatlock" xmlns:w16se="http://schemas.microsoft.com/office/word/2015/wordml/symex" xmlns:w16du="http://schemas.microsoft.com/office/word/2023/wordml/word16du" xmlns:wne="http://schemas.microsoft.com/office/word/2006/wordml" mc:Ignorable="w14 w15 w16se w16cid w16 w16cex w16sdtdh w16sdtfl w16du wp14">
   <w:footnote w:type="separator" w:id="-1">
     <w:p>
       <w:r>
@@ -8416,7 +8380,7 @@
 </file>
 
 <file path=word/numbering.xml><?xml version="1.0" encoding="utf-8"?>
-<w:numbering xmlns:wpc="http://schemas.microsoft.com/office/word/2010/wordprocessingCanvas" xmlns:cx="http://schemas.microsoft.com/office/drawing/2014/chartex" xmlns:cx1="http://schemas.microsoft.com/office/drawing/2015/9/8/chartex" xmlns:cx2="http://schemas.microsoft.com/office/drawing/2015/10/21/chartex" xmlns:cx3="http://schemas.microsoft.com/office/drawing/2016/5/9/chartex" xmlns:cx4="http://schemas.microsoft.com/office/drawing/2016/5/10/chartex" xmlns:cx5="http://schemas.microsoft.com/office/drawing/2016/5/11/chartex" xmlns:cx6="http://schemas.microsoft.com/office/drawing/2016/5/12/chartex" xmlns:cx7="http://schemas.microsoft.com/office/drawing/2016/5/13/chartex" xmlns:cx8="http://schemas.microsoft.com/office/drawing/2016/5/14/chartex" xmlns:mc="http://schemas.openxmlformats.org/markup-compatibility/2006" xmlns:aink="http://schemas.microsoft.com/office/drawing/2016/ink" xmlns:am3d="http://schemas.microsoft.com/office/drawing/2017/model3d" xmlns:o="urn:schemas-microsoft-com:office:office" xmlns:oel="http://schemas.microsoft.com/office/2019/extlst" xmlns:r="http://schemas.openxmlformats.org/officeDocument/2006/relationships" xmlns:m="http://schemas.openxmlformats.org/officeDocument/2006/math" xmlns:v="urn:schemas-microsoft-com:vml" xmlns:wp14="http://schemas.microsoft.com/office/word/2010/wordprocessingDrawing" xmlns:wp="http://schemas.openxmlformats.org/drawingml/2006/wordprocessingDrawing" xmlns:w10="urn:schemas-microsoft-com:office:word" xmlns:w="http://schemas.openxmlformats.org/wordprocessingml/2006/main" xmlns:w14="http://schemas.microsoft.com/office/word/2010/wordml" xmlns:w15="http://schemas.microsoft.com/office/word/2012/wordml" xmlns:w16cex="http://schemas.microsoft.com/office/word/2018/wordml/cex" xmlns:w16cid="http://schemas.microsoft.com/office/word/2016/wordml/cid" xmlns:w16="http://schemas.microsoft.com/office/word/2018/wordml" xmlns:w16du="http://schemas.microsoft.com/office/word/2023/wordml/word16du" xmlns:w16sdtdh="http://schemas.microsoft.com/office/word/2020/wordml/sdtdatahash" xmlns:w16sdtfl="http://schemas.microsoft.com/office/word/2024/wordml/sdtformatlock" xmlns:w16se="http://schemas.microsoft.com/office/word/2015/wordml/symex" xmlns:wpg="http://schemas.microsoft.com/office/word/2010/wordprocessingGroup" xmlns:wpi="http://schemas.microsoft.com/office/word/2010/wordprocessingInk" xmlns:wne="http://schemas.microsoft.com/office/word/2006/wordml" xmlns:wps="http://schemas.microsoft.com/office/word/2010/wordprocessingShape" mc:Ignorable="w14 w15 w16se w16cid w16 w16cex w16sdtdh w16sdtfl w16du wp14">
+<w:numbering xmlns:wpc="http://schemas.microsoft.com/office/word/2010/wordprocessingCanvas" xmlns:cx="http://schemas.microsoft.com/office/drawing/2014/chartex" xmlns:cx1="http://schemas.microsoft.com/office/drawing/2015/9/8/chartex" xmlns:cx2="http://schemas.microsoft.com/office/drawing/2015/10/21/chartex" xmlns:cx3="http://schemas.microsoft.com/office/drawing/2016/5/9/chartex" xmlns:cx4="http://schemas.microsoft.com/office/drawing/2016/5/10/chartex" xmlns:cx5="http://schemas.microsoft.com/office/drawing/2016/5/11/chartex" xmlns:cx6="http://schemas.microsoft.com/office/drawing/2016/5/12/chartex" xmlns:cx7="http://schemas.microsoft.com/office/drawing/2016/5/13/chartex" xmlns:cx8="http://schemas.microsoft.com/office/drawing/2016/5/14/chartex" xmlns:mc="http://schemas.openxmlformats.org/markup-compatibility/2006" xmlns:m="http://schemas.openxmlformats.org/officeDocument/2006/math" xmlns:aink="http://schemas.microsoft.com/office/drawing/2016/ink" xmlns:am3d="http://schemas.microsoft.com/office/drawing/2017/model3d" xmlns:oel="http://schemas.microsoft.com/office/2019/extlst" xmlns:r="http://schemas.openxmlformats.org/officeDocument/2006/relationships" xmlns:wp14="http://schemas.microsoft.com/office/word/2010/wordprocessingDrawing" xmlns:wp="http://schemas.openxmlformats.org/drawingml/2006/wordprocessingDrawing" xmlns:wpg="http://schemas.microsoft.com/office/word/2010/wordprocessingGroup" xmlns:wpi="http://schemas.microsoft.com/office/word/2010/wordprocessingInk" xmlns:wps="http://schemas.microsoft.com/office/word/2010/wordprocessingShape" xmlns:o="urn:schemas-microsoft-com:office:office" xmlns:v="urn:schemas-microsoft-com:vml" xmlns:w10="urn:schemas-microsoft-com:office:word" xmlns:w="http://schemas.openxmlformats.org/wordprocessingml/2006/main" xmlns:w14="http://schemas.microsoft.com/office/word/2010/wordml" xmlns:w15="http://schemas.microsoft.com/office/word/2012/wordml" xmlns:w16cex="http://schemas.microsoft.com/office/word/2018/wordml/cex" xmlns:w16cid="http://schemas.microsoft.com/office/word/2016/wordml/cid" xmlns:w16="http://schemas.microsoft.com/office/word/2018/wordml" xmlns:w16sdtdh="http://schemas.microsoft.com/office/word/2020/wordml/sdtdatahash" xmlns:w16sdtfl="http://schemas.microsoft.com/office/word/2024/wordml/sdtformatlock" xmlns:w16se="http://schemas.microsoft.com/office/word/2015/wordml/symex" xmlns:w16du="http://schemas.microsoft.com/office/word/2023/wordml/word16du" xmlns:wne="http://schemas.microsoft.com/office/word/2006/wordml" mc:Ignorable="w14 w15 w16se w16cid w16 w16cex w16sdtdh w16sdtfl w16du wp14">
   <w:abstractNum w:abstractNumId="0" w15:restartNumberingAfterBreak="0">
     <w:nsid w:val="050C5722"/>
     <w:multiLevelType w:val="hybridMultilevel"/>
@@ -10232,7 +10196,7 @@
 </file>
 
 <file path=word/styles.xml><?xml version="1.0" encoding="utf-8"?>
-<w:styles xmlns:mc="http://schemas.openxmlformats.org/markup-compatibility/2006" xmlns:r="http://schemas.openxmlformats.org/officeDocument/2006/relationships" xmlns:w="http://schemas.openxmlformats.org/wordprocessingml/2006/main" xmlns:w14="http://schemas.microsoft.com/office/word/2010/wordml" xmlns:w15="http://schemas.microsoft.com/office/word/2012/wordml" xmlns:w16cex="http://schemas.microsoft.com/office/word/2018/wordml/cex" xmlns:w16cid="http://schemas.microsoft.com/office/word/2016/wordml/cid" xmlns:w16="http://schemas.microsoft.com/office/word/2018/wordml" xmlns:w16du="http://schemas.microsoft.com/office/word/2023/wordml/word16du" xmlns:w16sdtdh="http://schemas.microsoft.com/office/word/2020/wordml/sdtdatahash" xmlns:w16sdtfl="http://schemas.microsoft.com/office/word/2024/wordml/sdtformatlock" xmlns:w16se="http://schemas.microsoft.com/office/word/2015/wordml/symex" mc:Ignorable="w14 w15 w16se w16cid w16 w16cex w16sdtdh w16sdtfl w16du">
+<w:styles xmlns:mc="http://schemas.openxmlformats.org/markup-compatibility/2006" xmlns:r="http://schemas.openxmlformats.org/officeDocument/2006/relationships" xmlns:w="http://schemas.openxmlformats.org/wordprocessingml/2006/main" xmlns:w14="http://schemas.microsoft.com/office/word/2010/wordml" xmlns:w15="http://schemas.microsoft.com/office/word/2012/wordml" xmlns:w16cex="http://schemas.microsoft.com/office/word/2018/wordml/cex" xmlns:w16cid="http://schemas.microsoft.com/office/word/2016/wordml/cid" xmlns:w16="http://schemas.microsoft.com/office/word/2018/wordml" xmlns:w16sdtdh="http://schemas.microsoft.com/office/word/2020/wordml/sdtdatahash" xmlns:w16sdtfl="http://schemas.microsoft.com/office/word/2024/wordml/sdtformatlock" xmlns:w16se="http://schemas.microsoft.com/office/word/2015/wordml/symex" xmlns:w16du="http://schemas.microsoft.com/office/word/2023/wordml/word16du" mc:Ignorable="w14 w15 w16se w16cid w16 w16cex w16sdtdh w16sdtfl w16du">
   <w:docDefaults>
     <w:rPrDefault>
       <w:rPr>

</xml_diff>